<commit_message>
docs: mise a jour document Word avec section scikit-learn Isolation Forest
</commit_message>
<xml_diff>
--- a/explication_detection_aberrantes.docx
+++ b/explication_detection_aberrantes.docx
@@ -40,7 +40,7 @@
         <w:rPr>
           <w:color w:val="1E40AF"/>
         </w:rPr>
-        <w:t>Detection des valeurs aberrantes avec NumPy</w:t>
+        <w:t>Detection des valeurs aberrantes</w:t>
       </w:r>
     </w:p>
     <w:p>
@@ -52,7 +52,20 @@
           <w:i/>
           <w:sz w:val="24"/>
         </w:rPr>
-        <w:t>Methodes statistiques Z-score et IQR, export et comparaison des donnees</w:t>
+        <w:t>NumPy (Z-score, IQR) + scikit-learn (Isolation Forest)</w:t>
+      </w:r>
+    </w:p>
+    <w:p/>
+    <w:p>
+      <w:pPr>
+        <w:jc w:val="center"/>
+      </w:pPr>
+      <w:r>
+        <w:rPr>
+          <w:i/>
+          <w:sz w:val="22"/>
+        </w:rPr>
+        <w:t>Export complet/nettoye et comparaison visuelle des donnees IoT</w:t>
       </w:r>
     </w:p>
     <w:p/>
@@ -65,7 +78,7 @@
         <w:rPr>
           <w:sz w:val="22"/>
         </w:rPr>
-        <w:t>Date : 21/05/2026</w:t>
+        <w:t>Date : 22/05/2026</w:t>
       </w:r>
     </w:p>
     <w:p>
@@ -86,7 +99,7 @@
     </w:p>
     <w:p>
       <w:r>
-        <w:t>Dans le cadre du systeme d'alertes IoT developpe lors de ce stage, les capteurs (temperature, turbidite, pH) transmettent des mesures en temps reel. Certaines de ces mesures peuvent etre aberrantes — dues a un bruit electronique, une panne passagere ou une transmission corrompue. Mon encadreur a demande d'utiliser NumPy pour implementer des methodes statistiques de detection de ces valeurs aberrantes.</w:t>
+        <w:t>Dans le cadre du systeme d'alertes IoT developpe lors de ce stage, les capteurs (temperature, turbidite, pH) transmettent des mesures en temps reel. Certaines de ces mesures peuvent etre aberrantes — dues a un bruit electronique, une panne passagere ou une transmission corrompue. Mon encadreur a demande d'utiliser NumPy et scikit-learn pour implementer des methodes statistiques et d'apprentissage automatique de detection.</w:t>
       </w:r>
     </w:p>
     <w:p>
@@ -127,7 +140,7 @@
         <w:rPr>
           <w:sz w:val="22"/>
         </w:rPr>
-        <w:t>Permettre l'export des donnees en deux versions : completes (avec aberrantes) et nettoyees (sans aberrantes), en CSV, Excel et PDF.</w:t>
+        <w:t>Permettre l'export des donnees en deux versions : completes et nettoyees (CSV, Excel, PDF).</w:t>
       </w:r>
     </w:p>
     <w:p>
@@ -138,12 +151,12 @@
         <w:rPr>
           <w:color w:val="1E40AF"/>
         </w:rPr>
-        <w:t>2. Role de NumPy dans la detection</w:t>
+        <w:t>2. Methodes statistiques avec NumPy</w:t>
       </w:r>
     </w:p>
     <w:p>
       <w:r>
-        <w:t>NumPy (Numerical Python) est une bibliotheque de calcul scientifique. Elle permet d'effectuer des operations mathematiques vectorisees (rapides) sur des tableaux de donnees. Dans ce projet, NumPy est utilise pour calculer en temps reel les statistiques d'une fenetre glissante de 30 lectures par capteur.</w:t>
+        <w:t>NumPy (Numerical Python) est une bibliotheque de calcul scientifique. Elle permet d'effectuer des operations mathematiques vectorisees sur des tableaux de donnees. Dans ce projet, NumPy est utilise pour calculer en temps reel les statistiques d'une fenetre glissante de 30 lectures par capteur.</w:t>
       </w:r>
     </w:p>
     <w:p>
@@ -154,12 +167,12 @@
         <w:rPr>
           <w:color w:val="165AA0"/>
         </w:rPr>
-        <w:t>2.1 Methode Z-score</w:t>
+        <w:t>2.1 Z-score</w:t>
       </w:r>
     </w:p>
     <w:p>
       <w:r>
-        <w:t>Le Z-score mesure l'ecart d'une valeur par rapport a la moyenne de son groupe, exprime en nombre d'ecarts-types. Plus le Z-score est eleve (en valeur absolue), plus la valeur est eloignee de la normale.</w:t>
+        <w:t>Le Z-score mesure l'ecart d'une valeur par rapport a la moyenne de son groupe, exprime en nombre d'ecarts-types. Plus le Z-score est eleve en valeur absolue, plus la valeur est eloignee de la normale.</w:t>
       </w:r>
     </w:p>
     <w:p>
@@ -243,7 +256,7 @@
           <w:color w:val="1E40AF"/>
           <w:sz w:val="18"/>
         </w:rPr>
-        <w:t xml:space="preserve">        self._windows = {}           # une fenetre par capteur</w:t>
+        <w:t xml:space="preserve">        self._windows = {}</w:t>
       </w:r>
     </w:p>
     <w:p>
@@ -299,7 +312,7 @@
           <w:color w:val="1E40AF"/>
           <w:sz w:val="18"/>
         </w:rPr>
-        <w:t xml:space="preserve">    def detect(self, sensor, value):</w:t>
+        <w:t xml:space="preserve">    def analyze(self, sensor, value):</w:t>
       </w:r>
     </w:p>
     <w:p>
@@ -313,7 +326,49 @@
           <w:color w:val="1E40AF"/>
           <w:sz w:val="18"/>
         </w:rPr>
-        <w:t xml:space="preserve">        win = self._windows.setdefault(sensor, deque(maxlen=self.window))</w:t>
+        <w:t xml:space="preserve">        win = self._windows.setdefault(sensor, deque(maxlen=30))</w:t>
+      </w:r>
+    </w:p>
+    <w:p>
+      <w:pPr>
+        <w:spacing w:before="0" w:after="0"/>
+        <w:ind w:left="850"/>
+      </w:pPr>
+      <w:r>
+        <w:rPr>
+          <w:rFonts w:ascii="Courier New" w:hAnsi="Courier New"/>
+          <w:color w:val="1E40AF"/>
+          <w:sz w:val="18"/>
+        </w:rPr>
+        <w:t xml:space="preserve">        arr  = np.array(win)         # conversion en tableau NumPy</w:t>
+      </w:r>
+    </w:p>
+    <w:p>
+      <w:pPr>
+        <w:spacing w:before="0" w:after="0"/>
+        <w:ind w:left="850"/>
+      </w:pPr>
+      <w:r>
+        <w:rPr>
+          <w:rFonts w:ascii="Courier New" w:hAnsi="Courier New"/>
+          <w:color w:val="1E40AF"/>
+          <w:sz w:val="18"/>
+        </w:rPr>
+        <w:t xml:space="preserve">        mean = arr.mean()            # moyenne de la fenetre</w:t>
+      </w:r>
+    </w:p>
+    <w:p>
+      <w:pPr>
+        <w:spacing w:before="0" w:after="0"/>
+        <w:ind w:left="850"/>
+      </w:pPr>
+      <w:r>
+        <w:rPr>
+          <w:rFonts w:ascii="Courier New" w:hAnsi="Courier New"/>
+          <w:color w:val="1E40AF"/>
+          <w:sz w:val="18"/>
+        </w:rPr>
+        <w:t xml:space="preserve">        std  = arr.std()             # ecart-type</w:t>
       </w:r>
     </w:p>
     <w:p>
@@ -341,91 +396,7 @@
           <w:color w:val="1E40AF"/>
           <w:sz w:val="18"/>
         </w:rPr>
-        <w:t xml:space="preserve">        if len(win) &lt; 5:</w:t>
-      </w:r>
-    </w:p>
-    <w:p>
-      <w:pPr>
-        <w:spacing w:before="0" w:after="0"/>
-        <w:ind w:left="850"/>
-      </w:pPr>
-      <w:r>
-        <w:rPr>
-          <w:rFonts w:ascii="Courier New" w:hAnsi="Courier New"/>
-          <w:color w:val="1E40AF"/>
-          <w:sz w:val="18"/>
-        </w:rPr>
-        <w:t xml:space="preserve">            return "NORMAL"          # pas assez de donnees</w:t>
-      </w:r>
-    </w:p>
-    <w:p>
-      <w:pPr>
-        <w:spacing w:before="0" w:after="0"/>
-        <w:ind w:left="850"/>
-      </w:pPr>
-      <w:r>
-        <w:rPr>
-          <w:rFonts w:ascii="Courier New" w:hAnsi="Courier New"/>
-          <w:color w:val="1E40AF"/>
-          <w:sz w:val="18"/>
-        </w:rPr>
-        <w:t xml:space="preserve">        arr  = np.array(win)         # conversion en tableau NumPy</w:t>
-      </w:r>
-    </w:p>
-    <w:p>
-      <w:pPr>
-        <w:spacing w:before="0" w:after="0"/>
-        <w:ind w:left="850"/>
-      </w:pPr>
-      <w:r>
-        <w:rPr>
-          <w:rFonts w:ascii="Courier New" w:hAnsi="Courier New"/>
-          <w:color w:val="1E40AF"/>
-          <w:sz w:val="18"/>
-        </w:rPr>
-        <w:t xml:space="preserve">        mean = arr.mean()            # moyenne de la fenetre</w:t>
-      </w:r>
-    </w:p>
-    <w:p>
-      <w:pPr>
-        <w:spacing w:before="0" w:after="0"/>
-        <w:ind w:left="850"/>
-      </w:pPr>
-      <w:r>
-        <w:rPr>
-          <w:rFonts w:ascii="Courier New" w:hAnsi="Courier New"/>
-          <w:color w:val="1E40AF"/>
-          <w:sz w:val="18"/>
-        </w:rPr>
-        <w:t xml:space="preserve">        std  = arr.std()             # ecart-type</w:t>
-      </w:r>
-    </w:p>
-    <w:p>
-      <w:pPr>
-        <w:spacing w:before="0" w:after="0"/>
-        <w:ind w:left="850"/>
-      </w:pPr>
-      <w:r>
-        <w:rPr>
-          <w:rFonts w:ascii="Courier New" w:hAnsi="Courier New"/>
-          <w:color w:val="1E40AF"/>
-          <w:sz w:val="18"/>
-        </w:rPr>
-        <w:t xml:space="preserve">        if std == 0:</w:t>
-      </w:r>
-    </w:p>
-    <w:p>
-      <w:pPr>
-        <w:spacing w:before="0" w:after="0"/>
-        <w:ind w:left="850"/>
-      </w:pPr>
-      <w:r>
-        <w:rPr>
-          <w:rFonts w:ascii="Courier New" w:hAnsi="Courier New"/>
-          <w:color w:val="1E40AF"/>
-          <w:sz w:val="18"/>
-        </w:rPr>
-        <w:t xml:space="preserve">            return "NORMAL"</w:t>
+        <w:t xml:space="preserve">        if std == 0: return "NORMAL"</w:t>
       </w:r>
     </w:p>
     <w:p>
@@ -494,31 +465,31 @@
           <w:b/>
           <w:sz w:val="22"/>
         </w:rPr>
-        <w:t xml:space="preserve">np.array() : </w:t>
-      </w:r>
-      <w:r>
-        <w:rPr>
-          <w:sz w:val="22"/>
-        </w:rPr>
-        <w:t>arr.mean() : calcule la moyenne des 30 dernieres valeurs du capteur.</w:t>
-      </w:r>
-    </w:p>
-    <w:p>
-      <w:pPr>
-        <w:pStyle w:val="ListBullet"/>
-      </w:pPr>
-      <w:r>
-        <w:rPr>
-          <w:b/>
-          <w:sz w:val="22"/>
-        </w:rPr>
         <w:t xml:space="preserve">arr.mean() : </w:t>
       </w:r>
       <w:r>
         <w:rPr>
           <w:sz w:val="22"/>
         </w:rPr>
-        <w:t>arr.std()  : calcule l'ecart-type (dispersion) de ces valeurs.</w:t>
+        <w:t>np.array() convertit la fenetre en tableau vectorise traite en C.</w:t>
+      </w:r>
+    </w:p>
+    <w:p>
+      <w:pPr>
+        <w:pStyle w:val="ListBullet"/>
+      </w:pPr>
+      <w:r>
+        <w:rPr>
+          <w:b/>
+          <w:sz w:val="22"/>
+        </w:rPr>
+        <w:t xml:space="preserve">arr.std() : </w:t>
+      </w:r>
+      <w:r>
+        <w:rPr>
+          <w:sz w:val="22"/>
+        </w:rPr>
+        <w:t>arr.std() calcule l'ecart-type de dispersion des valeurs.</w:t>
       </w:r>
     </w:p>
     <w:p>
@@ -536,7 +507,7 @@
         <w:rPr>
           <w:sz w:val="22"/>
         </w:rPr>
-        <w:t>Si |z| &gt; 3 : valeur CRITIQUE. Si |z| &gt; 2 : WARNING. Sinon NORMAL.</w:t>
+        <w:t>Si |z| &gt; 3 : CRITICAL. Si |z| &gt; 2 : WARNING. Sinon : NORMAL.</w:t>
       </w:r>
     </w:p>
     <w:p>
@@ -547,12 +518,12 @@
         <w:rPr>
           <w:color w:val="165AA0"/>
         </w:rPr>
-        <w:t>2.2 Methode IQR (ecart interquartile)</w:t>
+        <w:t>2.2 IQR (ecart interquartile)</w:t>
       </w:r>
     </w:p>
     <w:p>
       <w:r>
-        <w:t>L'IQR (Interquartile Range) est plus robuste que le Z-score car il est insensible aux valeurs extremes deja presentes dans la fenetre. Il definit des bornes basees sur les quartiles Q1 et Q3.</w:t>
+        <w:t>L'IQR est plus robuste que le Z-score car il est insensible aux extremes deja presents dans la fenetre. Il definit des bornes basees sur les quartiles Q1 et Q3.</w:t>
       </w:r>
     </w:p>
     <w:p>
@@ -580,7 +551,7 @@
           <w:color w:val="1E40AF"/>
           <w:sz w:val="18"/>
         </w:rPr>
-        <w:t xml:space="preserve">    def detect(self, sensor, value):</w:t>
+        <w:t xml:space="preserve">    def analyze(self, sensor, value):</w:t>
       </w:r>
     </w:p>
     <w:p>
@@ -594,63 +565,7 @@
           <w:color w:val="1E40AF"/>
           <w:sz w:val="18"/>
         </w:rPr>
-        <w:t xml:space="preserve">        win = self._windows.setdefault(sensor, deque(maxlen=self.window))</w:t>
-      </w:r>
-    </w:p>
-    <w:p>
-      <w:pPr>
-        <w:spacing w:before="0" w:after="0"/>
-        <w:ind w:left="850"/>
-      </w:pPr>
-      <w:r>
-        <w:rPr>
-          <w:rFonts w:ascii="Courier New" w:hAnsi="Courier New"/>
-          <w:color w:val="1E40AF"/>
-          <w:sz w:val="18"/>
-        </w:rPr>
-        <w:t xml:space="preserve">        win.append(value)</w:t>
-      </w:r>
-    </w:p>
-    <w:p>
-      <w:pPr>
-        <w:spacing w:before="0" w:after="0"/>
-        <w:ind w:left="850"/>
-      </w:pPr>
-      <w:r>
-        <w:rPr>
-          <w:rFonts w:ascii="Courier New" w:hAnsi="Courier New"/>
-          <w:color w:val="1E40AF"/>
-          <w:sz w:val="18"/>
-        </w:rPr>
-        <w:t xml:space="preserve">        if len(win) &lt; 5:</w:t>
-      </w:r>
-    </w:p>
-    <w:p>
-      <w:pPr>
-        <w:spacing w:before="0" w:after="0"/>
-        <w:ind w:left="850"/>
-      </w:pPr>
-      <w:r>
-        <w:rPr>
-          <w:rFonts w:ascii="Courier New" w:hAnsi="Courier New"/>
-          <w:color w:val="1E40AF"/>
-          <w:sz w:val="18"/>
-        </w:rPr>
-        <w:t xml:space="preserve">            return "NORMAL"</w:t>
-      </w:r>
-    </w:p>
-    <w:p>
-      <w:pPr>
-        <w:spacing w:before="0" w:after="0"/>
-        <w:ind w:left="850"/>
-      </w:pPr>
-      <w:r>
-        <w:rPr>
-          <w:rFonts w:ascii="Courier New" w:hAnsi="Courier New"/>
-          <w:color w:val="1E40AF"/>
-          <w:sz w:val="18"/>
-        </w:rPr>
-        <w:t xml:space="preserve">        arr = np.array(win)</w:t>
+        <w:t xml:space="preserve">        arr = np.array(window)</w:t>
       </w:r>
     </w:p>
     <w:p>
@@ -692,7 +607,7 @@
           <w:color w:val="1E40AF"/>
           <w:sz w:val="18"/>
         </w:rPr>
-        <w:t xml:space="preserve">        iqr = q3 - q1                  # ecart interquartile</w:t>
+        <w:t xml:space="preserve">        iqr = q3 - q1</w:t>
       </w:r>
     </w:p>
     <w:p>
@@ -809,7 +724,7 @@
         <w:rPr>
           <w:sz w:val="22"/>
         </w:rPr>
-        <w:t>np.percentile(arr, 25) calcule le 1er quartile (25% des valeurs sont en dessous).</w:t>
+        <w:t>np.percentile(arr, 25) : 1er quartile (25% des valeurs en dessous).</w:t>
       </w:r>
     </w:p>
     <w:p>
@@ -827,7 +742,7 @@
         <w:rPr>
           <w:sz w:val="22"/>
         </w:rPr>
-        <w:t>np.percentile(arr, 75) calcule le 3e quartile.</w:t>
+        <w:t>np.percentile(arr, 75) : 3e quartile.</w:t>
       </w:r>
     </w:p>
     <w:p>
@@ -845,7 +760,7 @@
         <w:rPr>
           <w:sz w:val="22"/>
         </w:rPr>
-        <w:t>IQR = Q3 - Q1. Les bornes WARNING sont Q1 - 1.5*IQR et Q3 + 1.5*IQR. Les bornes CRITICAL sont Q1 - 3*IQR et Q3 + 3*IQR.</w:t>
+        <w:t>IQR = Q3 - Q1. Bornes WARNING : x1.5. Bornes CRITICAL : x3.0.</w:t>
       </w:r>
     </w:p>
     <w:p>
@@ -1089,12 +1004,77 @@
         <w:rPr>
           <w:color w:val="1E40AF"/>
         </w:rPr>
-        <w:t>3. Moteur de detection combine</w:t>
+        <w:t>3. Apprentissage automatique avec scikit-learn</w:t>
       </w:r>
     </w:p>
     <w:p>
       <w:r>
-        <w:t>Le moteur de detection (DetectionEngine) combine trois sources de detection : les regles metier fixes (seuils de temperature, pH, turbidite), le Z-score NumPy et l'IQR NumPy. Il retourne le niveau le plus severe parmi les trois.</w:t>
+        <w:t>scikit-learn est la bibliotheque de reference pour le Machine Learning en Python. Elle fournit des algorithmes pre-implementes, optimises et documentes. J'ai utilise l'algorithme Isolation Forest pour completer la detection statistique par une approche d'apprentissage non-supervise.</w:t>
+      </w:r>
+    </w:p>
+    <w:p>
+      <w:pPr>
+        <w:pStyle w:val="Heading2"/>
+      </w:pPr>
+      <w:r>
+        <w:rPr>
+          <w:color w:val="165AA0"/>
+        </w:rPr>
+        <w:t>3.1 Principe de l'Isolation Forest</w:t>
+      </w:r>
+    </w:p>
+    <w:p>
+      <w:r>
+        <w:t>L'Isolation Forest fonctionne en construisant 100 arbres de decision aleatoires. A chaque arbre, l'algorithme choisit aleatoirement un attribut et une valeur de coupure pour isoler les points de donnees :</w:t>
+      </w:r>
+    </w:p>
+    <w:p>
+      <w:pPr>
+        <w:pStyle w:val="ListBullet"/>
+      </w:pPr>
+      <w:r>
+        <w:rPr>
+          <w:sz w:val="22"/>
+        </w:rPr>
+        <w:t>Une valeur NORMALE necessite de nombreuses coupures pour etre isolee (chemin long).</w:t>
+      </w:r>
+    </w:p>
+    <w:p>
+      <w:pPr>
+        <w:pStyle w:val="ListBullet"/>
+      </w:pPr>
+      <w:r>
+        <w:rPr>
+          <w:sz w:val="22"/>
+        </w:rPr>
+        <w:t>Une valeur ABERRANTE est isolee rapidement car elle est rare et extreme (chemin court).</w:t>
+      </w:r>
+    </w:p>
+    <w:p>
+      <w:pPr>
+        <w:pStyle w:val="ListBullet"/>
+      </w:pPr>
+      <w:r>
+        <w:rPr>
+          <w:sz w:val="22"/>
+        </w:rPr>
+        <w:t>Le score est la longueur moyenne du chemin : negatif = anomalie, positif = normal.</w:t>
+      </w:r>
+    </w:p>
+    <w:p>
+      <w:r>
+        <w:t>Contrairement a Z-score et IQR qui supposent une distribution gaussienne ou symetrique, l'Isolation Forest ne fait aucune hypothese sur la forme de la distribution. Il est particulierement efficace pour detecter des anomalies multidimensionnelles et les comportements inhabituels difficiles a capter par des seuils fixes.</w:t>
+      </w:r>
+    </w:p>
+    <w:p>
+      <w:pPr>
+        <w:pStyle w:val="Heading2"/>
+      </w:pPr>
+      <w:r>
+        <w:rPr>
+          <w:color w:val="165AA0"/>
+        </w:rPr>
+        <w:t>3.2 Implementation dans le projet</w:t>
       </w:r>
     </w:p>
     <w:p>
@@ -1108,7 +1088,7 @@
           <w:color w:val="1E40AF"/>
           <w:sz w:val="18"/>
         </w:rPr>
-        <w:t>class DetectionEngine:</w:t>
+        <w:t>from sklearn.ensemble import IsolationForest</w:t>
       </w:r>
     </w:p>
     <w:p>
@@ -1122,7 +1102,7 @@
           <w:color w:val="1E40AF"/>
           <w:sz w:val="18"/>
         </w:rPr>
-        <w:t xml:space="preserve">    def detect(self, sensor, value, unit=""):</w:t>
+        <w:t>import numpy as np</w:t>
       </w:r>
     </w:p>
     <w:p>
@@ -1136,7 +1116,7 @@
           <w:color w:val="1E40AF"/>
           <w:sz w:val="18"/>
         </w:rPr>
-        <w:t xml:space="preserve">        levels = [</w:t>
+        <w:t>from collections import deque</w:t>
       </w:r>
     </w:p>
     <w:p>
@@ -1150,7 +1130,7 @@
           <w:color w:val="1E40AF"/>
           <w:sz w:val="18"/>
         </w:rPr>
-        <w:t xml:space="preserve">            RuleDetector().detect(sensor, value),</w:t>
+        <w:t xml:space="preserve"> </w:t>
       </w:r>
     </w:p>
     <w:p>
@@ -1164,7 +1144,7 @@
           <w:color w:val="1E40AF"/>
           <w:sz w:val="18"/>
         </w:rPr>
-        <w:t xml:space="preserve">            ZScoreDetector().detect(sensor, value),</w:t>
+        <w:t>class IsolationForestDetector:</w:t>
       </w:r>
     </w:p>
     <w:p>
@@ -1178,7 +1158,7 @@
           <w:color w:val="1E40AF"/>
           <w:sz w:val="18"/>
         </w:rPr>
-        <w:t xml:space="preserve">            IQRDetector().detect(sensor, value),</w:t>
+        <w:t xml:space="preserve">    def __init__(self, window_size=100, min_samples=20,</w:t>
       </w:r>
     </w:p>
     <w:p>
@@ -1192,7 +1172,7 @@
           <w:color w:val="1E40AF"/>
           <w:sz w:val="18"/>
         </w:rPr>
-        <w:t xml:space="preserve">        ]</w:t>
+        <w:t xml:space="preserve">                 contamination=0.05, retrain_every=20):</w:t>
       </w:r>
     </w:p>
     <w:p>
@@ -1206,7 +1186,7 @@
           <w:color w:val="1E40AF"/>
           <w:sz w:val="18"/>
         </w:rPr>
-        <w:t xml:space="preserve">        # Priorite : CRITICAL &gt; WARNING &gt; NORMAL</w:t>
+        <w:t xml:space="preserve">        self.contamination = contamination   # 5% d'anomalies attendues</w:t>
       </w:r>
     </w:p>
     <w:p>
@@ -1220,7 +1200,7 @@
           <w:color w:val="1E40AF"/>
           <w:sz w:val="18"/>
         </w:rPr>
-        <w:t xml:space="preserve">        if "CRITICAL" in levels: return "CRITICAL"</w:t>
+        <w:t xml:space="preserve">        self._windows = {}                   # fenetre par capteur</w:t>
       </w:r>
     </w:p>
     <w:p>
@@ -1234,7 +1214,413 @@
           <w:color w:val="1E40AF"/>
           <w:sz w:val="18"/>
         </w:rPr>
-        <w:t xml:space="preserve">        if "WARNING"  in levels: return "WARNING"</w:t>
+        <w:t xml:space="preserve">        self._models  = {}                   # modele entraine par capteur</w:t>
+      </w:r>
+    </w:p>
+    <w:p>
+      <w:pPr>
+        <w:spacing w:before="0" w:after="0"/>
+        <w:ind w:left="850"/>
+      </w:pPr>
+      <w:r>
+        <w:rPr>
+          <w:rFonts w:ascii="Courier New" w:hAnsi="Courier New"/>
+          <w:color w:val="1E40AF"/>
+          <w:sz w:val="18"/>
+        </w:rPr>
+        <w:t xml:space="preserve">        self._counts  = {}                   # compteur pour reentrain.</w:t>
+      </w:r>
+    </w:p>
+    <w:p>
+      <w:pPr>
+        <w:spacing w:before="0" w:after="0"/>
+        <w:ind w:left="850"/>
+      </w:pPr>
+      <w:r>
+        <w:rPr>
+          <w:rFonts w:ascii="Courier New" w:hAnsi="Courier New"/>
+          <w:color w:val="1E40AF"/>
+          <w:sz w:val="18"/>
+        </w:rPr>
+        <w:t xml:space="preserve"> </w:t>
+      </w:r>
+    </w:p>
+    <w:p>
+      <w:pPr>
+        <w:spacing w:before="0" w:after="0"/>
+        <w:ind w:left="850"/>
+      </w:pPr>
+      <w:r>
+        <w:rPr>
+          <w:rFonts w:ascii="Courier New" w:hAnsi="Courier New"/>
+          <w:color w:val="1E40AF"/>
+          <w:sz w:val="18"/>
+        </w:rPr>
+        <w:t xml:space="preserve">    def _train(self, sensor):</w:t>
+      </w:r>
+    </w:p>
+    <w:p>
+      <w:pPr>
+        <w:spacing w:before="0" w:after="0"/>
+        <w:ind w:left="850"/>
+      </w:pPr>
+      <w:r>
+        <w:rPr>
+          <w:rFonts w:ascii="Courier New" w:hAnsi="Courier New"/>
+          <w:color w:val="1E40AF"/>
+          <w:sz w:val="18"/>
+        </w:rPr>
+        <w:t xml:space="preserve">        arr = np.array(self._windows[sensor]).reshape(-1, 1)</w:t>
+      </w:r>
+    </w:p>
+    <w:p>
+      <w:pPr>
+        <w:spacing w:before="0" w:after="0"/>
+        <w:ind w:left="850"/>
+      </w:pPr>
+      <w:r>
+        <w:rPr>
+          <w:rFonts w:ascii="Courier New" w:hAnsi="Courier New"/>
+          <w:color w:val="1E40AF"/>
+          <w:sz w:val="18"/>
+        </w:rPr>
+        <w:t xml:space="preserve">        model = IsolationForest(</w:t>
+      </w:r>
+    </w:p>
+    <w:p>
+      <w:pPr>
+        <w:spacing w:before="0" w:after="0"/>
+        <w:ind w:left="850"/>
+      </w:pPr>
+      <w:r>
+        <w:rPr>
+          <w:rFonts w:ascii="Courier New" w:hAnsi="Courier New"/>
+          <w:color w:val="1E40AF"/>
+          <w:sz w:val="18"/>
+        </w:rPr>
+        <w:t xml:space="preserve">            n_estimators  = 100,     # 100 arbres d'isolation</w:t>
+      </w:r>
+    </w:p>
+    <w:p>
+      <w:pPr>
+        <w:spacing w:before="0" w:after="0"/>
+        <w:ind w:left="850"/>
+      </w:pPr>
+      <w:r>
+        <w:rPr>
+          <w:rFonts w:ascii="Courier New" w:hAnsi="Courier New"/>
+          <w:color w:val="1E40AF"/>
+          <w:sz w:val="18"/>
+        </w:rPr>
+        <w:t xml:space="preserve">            contamination = self.contamination,</w:t>
+      </w:r>
+    </w:p>
+    <w:p>
+      <w:pPr>
+        <w:spacing w:before="0" w:after="0"/>
+        <w:ind w:left="850"/>
+      </w:pPr>
+      <w:r>
+        <w:rPr>
+          <w:rFonts w:ascii="Courier New" w:hAnsi="Courier New"/>
+          <w:color w:val="1E40AF"/>
+          <w:sz w:val="18"/>
+        </w:rPr>
+        <w:t xml:space="preserve">            random_state  = 42,      # reproductible</w:t>
+      </w:r>
+    </w:p>
+    <w:p>
+      <w:pPr>
+        <w:spacing w:before="0" w:after="0"/>
+        <w:ind w:left="850"/>
+      </w:pPr>
+      <w:r>
+        <w:rPr>
+          <w:rFonts w:ascii="Courier New" w:hAnsi="Courier New"/>
+          <w:color w:val="1E40AF"/>
+          <w:sz w:val="18"/>
+        </w:rPr>
+        <w:t xml:space="preserve">        )</w:t>
+      </w:r>
+    </w:p>
+    <w:p>
+      <w:pPr>
+        <w:spacing w:before="0" w:after="0"/>
+        <w:ind w:left="850"/>
+      </w:pPr>
+      <w:r>
+        <w:rPr>
+          <w:rFonts w:ascii="Courier New" w:hAnsi="Courier New"/>
+          <w:color w:val="1E40AF"/>
+          <w:sz w:val="18"/>
+        </w:rPr>
+        <w:t xml:space="preserve">        model.fit(arr)               # apprentissage non-supervise</w:t>
+      </w:r>
+    </w:p>
+    <w:p>
+      <w:pPr>
+        <w:spacing w:before="0" w:after="0"/>
+        <w:ind w:left="850"/>
+      </w:pPr>
+      <w:r>
+        <w:rPr>
+          <w:rFonts w:ascii="Courier New" w:hAnsi="Courier New"/>
+          <w:color w:val="1E40AF"/>
+          <w:sz w:val="18"/>
+        </w:rPr>
+        <w:t xml:space="preserve">        self._models[sensor] = model</w:t>
+      </w:r>
+    </w:p>
+    <w:p>
+      <w:pPr>
+        <w:spacing w:before="0" w:after="0"/>
+        <w:ind w:left="850"/>
+      </w:pPr>
+      <w:r>
+        <w:rPr>
+          <w:rFonts w:ascii="Courier New" w:hAnsi="Courier New"/>
+          <w:color w:val="1E40AF"/>
+          <w:sz w:val="18"/>
+        </w:rPr>
+        <w:t xml:space="preserve"> </w:t>
+      </w:r>
+    </w:p>
+    <w:p>
+      <w:pPr>
+        <w:spacing w:before="0" w:after="0"/>
+        <w:ind w:left="850"/>
+      </w:pPr>
+      <w:r>
+        <w:rPr>
+          <w:rFonts w:ascii="Courier New" w:hAnsi="Courier New"/>
+          <w:color w:val="1E40AF"/>
+          <w:sz w:val="18"/>
+        </w:rPr>
+        <w:t xml:space="preserve">    def analyze(self, sensor, value):</w:t>
+      </w:r>
+    </w:p>
+    <w:p>
+      <w:pPr>
+        <w:spacing w:before="0" w:after="0"/>
+        <w:ind w:left="850"/>
+      </w:pPr>
+      <w:r>
+        <w:rPr>
+          <w:rFonts w:ascii="Courier New" w:hAnsi="Courier New"/>
+          <w:color w:val="1E40AF"/>
+          <w:sz w:val="18"/>
+        </w:rPr>
+        <w:t xml:space="preserve">        self._windows.setdefault(sensor, deque(maxlen=100)).append(value)</w:t>
+      </w:r>
+    </w:p>
+    <w:p>
+      <w:pPr>
+        <w:spacing w:before="0" w:after="0"/>
+        <w:ind w:left="850"/>
+      </w:pPr>
+      <w:r>
+        <w:rPr>
+          <w:rFonts w:ascii="Courier New" w:hAnsi="Courier New"/>
+          <w:color w:val="1E40AF"/>
+          <w:sz w:val="18"/>
+        </w:rPr>
+        <w:t xml:space="preserve">        self._counts[sensor] = self._counts.get(sensor, 0) + 1</w:t>
+      </w:r>
+    </w:p>
+    <w:p>
+      <w:pPr>
+        <w:spacing w:before="0" w:after="0"/>
+        <w:ind w:left="850"/>
+      </w:pPr>
+      <w:r>
+        <w:rPr>
+          <w:rFonts w:ascii="Courier New" w:hAnsi="Courier New"/>
+          <w:color w:val="1E40AF"/>
+          <w:sz w:val="18"/>
+        </w:rPr>
+        <w:t xml:space="preserve"> </w:t>
+      </w:r>
+    </w:p>
+    <w:p>
+      <w:pPr>
+        <w:spacing w:before="0" w:after="0"/>
+        <w:ind w:left="850"/>
+      </w:pPr>
+      <w:r>
+        <w:rPr>
+          <w:rFonts w:ascii="Courier New" w:hAnsi="Courier New"/>
+          <w:color w:val="1E40AF"/>
+          <w:sz w:val="18"/>
+        </w:rPr>
+        <w:t xml:space="preserve">        if len(self._windows[sensor]) &lt; 20:</w:t>
+      </w:r>
+    </w:p>
+    <w:p>
+      <w:pPr>
+        <w:spacing w:before="0" w:after="0"/>
+        <w:ind w:left="850"/>
+      </w:pPr>
+      <w:r>
+        <w:rPr>
+          <w:rFonts w:ascii="Courier New" w:hAnsi="Courier New"/>
+          <w:color w:val="1E40AF"/>
+          <w:sz w:val="18"/>
+        </w:rPr>
+        <w:t xml:space="preserve">            return "NORMAL"          # pas encore assez de donnees</w:t>
+      </w:r>
+    </w:p>
+    <w:p>
+      <w:pPr>
+        <w:spacing w:before="0" w:after="0"/>
+        <w:ind w:left="850"/>
+      </w:pPr>
+      <w:r>
+        <w:rPr>
+          <w:rFonts w:ascii="Courier New" w:hAnsi="Courier New"/>
+          <w:color w:val="1E40AF"/>
+          <w:sz w:val="18"/>
+        </w:rPr>
+        <w:t xml:space="preserve"> </w:t>
+      </w:r>
+    </w:p>
+    <w:p>
+      <w:pPr>
+        <w:spacing w:before="0" w:after="0"/>
+        <w:ind w:left="850"/>
+      </w:pPr>
+      <w:r>
+        <w:rPr>
+          <w:rFonts w:ascii="Courier New" w:hAnsi="Courier New"/>
+          <w:color w:val="1E40AF"/>
+          <w:sz w:val="18"/>
+        </w:rPr>
+        <w:t xml:space="preserve">        # Reentraine tous les 20 nouveaux points</w:t>
+      </w:r>
+    </w:p>
+    <w:p>
+      <w:pPr>
+        <w:spacing w:before="0" w:after="0"/>
+        <w:ind w:left="850"/>
+      </w:pPr>
+      <w:r>
+        <w:rPr>
+          <w:rFonts w:ascii="Courier New" w:hAnsi="Courier New"/>
+          <w:color w:val="1E40AF"/>
+          <w:sz w:val="18"/>
+        </w:rPr>
+        <w:t xml:space="preserve">        if sensor not in self._models or self._counts[sensor] % 20 == 0:</w:t>
+      </w:r>
+    </w:p>
+    <w:p>
+      <w:pPr>
+        <w:spacing w:before="0" w:after="0"/>
+        <w:ind w:left="850"/>
+      </w:pPr>
+      <w:r>
+        <w:rPr>
+          <w:rFonts w:ascii="Courier New" w:hAnsi="Courier New"/>
+          <w:color w:val="1E40AF"/>
+          <w:sz w:val="18"/>
+        </w:rPr>
+        <w:t xml:space="preserve">            self._train(sensor)</w:t>
+      </w:r>
+    </w:p>
+    <w:p>
+      <w:pPr>
+        <w:spacing w:before="0" w:after="0"/>
+        <w:ind w:left="850"/>
+      </w:pPr>
+      <w:r>
+        <w:rPr>
+          <w:rFonts w:ascii="Courier New" w:hAnsi="Courier New"/>
+          <w:color w:val="1E40AF"/>
+          <w:sz w:val="18"/>
+        </w:rPr>
+        <w:t xml:space="preserve"> </w:t>
+      </w:r>
+    </w:p>
+    <w:p>
+      <w:pPr>
+        <w:spacing w:before="0" w:after="0"/>
+        <w:ind w:left="850"/>
+      </w:pPr>
+      <w:r>
+        <w:rPr>
+          <w:rFonts w:ascii="Courier New" w:hAnsi="Courier New"/>
+          <w:color w:val="1E40AF"/>
+          <w:sz w:val="18"/>
+        </w:rPr>
+        <w:t xml:space="preserve">        score = self._models[sensor].decision_function([[value]])[0]</w:t>
+      </w:r>
+    </w:p>
+    <w:p>
+      <w:pPr>
+        <w:spacing w:before="0" w:after="0"/>
+        <w:ind w:left="850"/>
+      </w:pPr>
+      <w:r>
+        <w:rPr>
+          <w:rFonts w:ascii="Courier New" w:hAnsi="Courier New"/>
+          <w:color w:val="1E40AF"/>
+          <w:sz w:val="18"/>
+        </w:rPr>
+        <w:t xml:space="preserve">        pred  = self._models[sensor].predict([[value]])[0]  # -1 ou 1</w:t>
+      </w:r>
+    </w:p>
+    <w:p>
+      <w:pPr>
+        <w:spacing w:before="0" w:after="0"/>
+        <w:ind w:left="850"/>
+      </w:pPr>
+      <w:r>
+        <w:rPr>
+          <w:rFonts w:ascii="Courier New" w:hAnsi="Courier New"/>
+          <w:color w:val="1E40AF"/>
+          <w:sz w:val="18"/>
+        </w:rPr>
+        <w:t xml:space="preserve"> </w:t>
+      </w:r>
+    </w:p>
+    <w:p>
+      <w:pPr>
+        <w:spacing w:before="0" w:after="0"/>
+        <w:ind w:left="850"/>
+      </w:pPr>
+      <w:r>
+        <w:rPr>
+          <w:rFonts w:ascii="Courier New" w:hAnsi="Courier New"/>
+          <w:color w:val="1E40AF"/>
+          <w:sz w:val="18"/>
+        </w:rPr>
+        <w:t xml:space="preserve">        if pred == -1:</w:t>
+      </w:r>
+    </w:p>
+    <w:p>
+      <w:pPr>
+        <w:spacing w:before="0" w:after="0"/>
+        <w:ind w:left="850"/>
+      </w:pPr>
+      <w:r>
+        <w:rPr>
+          <w:rFonts w:ascii="Courier New" w:hAnsi="Courier New"/>
+          <w:color w:val="1E40AF"/>
+          <w:sz w:val="18"/>
+        </w:rPr>
+        <w:t xml:space="preserve">            if score &lt; -0.1: return "CRITICAL"</w:t>
+      </w:r>
+    </w:p>
+    <w:p>
+      <w:pPr>
+        <w:spacing w:before="0" w:after="0"/>
+        <w:ind w:left="850"/>
+      </w:pPr>
+      <w:r>
+        <w:rPr>
+          <w:rFonts w:ascii="Courier New" w:hAnsi="Courier New"/>
+          <w:color w:val="1E40AF"/>
+          <w:sz w:val="18"/>
+        </w:rPr>
+        <w:t xml:space="preserve">            return "WARNING"</w:t>
       </w:r>
     </w:p>
     <w:p>
@@ -1253,10 +1639,465 @@
     </w:p>
     <w:p/>
     <w:p>
+      <w:pPr>
+        <w:pStyle w:val="ListBullet"/>
+      </w:pPr>
       <w:r>
-        <w:t>Ainsi, une valeur peut etre marquee WARNING par les regles metier ET CRITICAL par le Z-score — le systeme retient CRITICAL. Ce mecanisme assure une couverture maximale des anomalies.</w:t>
+        <w:rPr>
+          <w:b/>
+          <w:sz w:val="22"/>
+        </w:rPr>
+        <w:t xml:space="preserve">fit() : </w:t>
+      </w:r>
+      <w:r>
+        <w:rPr>
+          <w:sz w:val="22"/>
+        </w:rPr>
+        <w:t>model.fit(arr) : entraine le modele sur la fenetre de 100 lectures (non-supervise).</w:t>
       </w:r>
     </w:p>
+    <w:p>
+      <w:pPr>
+        <w:pStyle w:val="ListBullet"/>
+      </w:pPr>
+      <w:r>
+        <w:rPr>
+          <w:b/>
+          <w:sz w:val="22"/>
+        </w:rPr>
+        <w:t xml:space="preserve">score : </w:t>
+      </w:r>
+      <w:r>
+        <w:rPr>
+          <w:sz w:val="22"/>
+        </w:rPr>
+        <w:t>decision_function() : retourne le score d'anomalie (negatif = suspect).</w:t>
+      </w:r>
+    </w:p>
+    <w:p>
+      <w:pPr>
+        <w:pStyle w:val="ListBullet"/>
+      </w:pPr>
+      <w:r>
+        <w:rPr>
+          <w:b/>
+          <w:sz w:val="22"/>
+        </w:rPr>
+        <w:t xml:space="preserve">predict() : </w:t>
+      </w:r>
+      <w:r>
+        <w:rPr>
+          <w:sz w:val="22"/>
+        </w:rPr>
+        <w:t>predict() : retourne -1 (anomalie) ou +1 (normal) selon le seuil contamination.</w:t>
+      </w:r>
+    </w:p>
+    <w:p>
+      <w:pPr>
+        <w:pStyle w:val="ListBullet"/>
+      </w:pPr>
+      <w:r>
+        <w:rPr>
+          <w:b/>
+          <w:sz w:val="22"/>
+        </w:rPr>
+        <w:t xml:space="preserve">seuils : </w:t>
+      </w:r>
+      <w:r>
+        <w:rPr>
+          <w:sz w:val="22"/>
+        </w:rPr>
+        <w:t>score &lt; -0.1 -&gt; CRITICAL (tres isole). score &lt; 0 -&gt; WARNING. score &gt; 0 -&gt; NORMAL.</w:t>
+      </w:r>
+    </w:p>
+    <w:p>
+      <w:pPr>
+        <w:pStyle w:val="Heading2"/>
+      </w:pPr>
+      <w:r>
+        <w:rPr>
+          <w:color w:val="165AA0"/>
+        </w:rPr>
+        <w:t>3.3 Comparaison des trois methodes</w:t>
+      </w:r>
+    </w:p>
+    <w:tbl>
+      <w:tblPr>
+        <w:tblStyle w:val="TableGrid"/>
+        <w:tblW w:type="auto" w:w="0"/>
+        <w:tblLook w:firstColumn="1" w:firstRow="1" w:lastColumn="0" w:lastRow="0" w:noHBand="0" w:noVBand="1" w:val="04A0"/>
+      </w:tblPr>
+      <w:tblGrid>
+        <w:gridCol w:w="2280"/>
+        <w:gridCol w:w="2280"/>
+        <w:gridCol w:w="2280"/>
+        <w:gridCol w:w="2280"/>
+      </w:tblGrid>
+      <w:tr>
+        <w:tc>
+          <w:tcPr>
+            <w:tcW w:type="dxa" w:w="2280"/>
+            <w:shd w:val="clear" w:color="auto" w:fill="1E3A8A"/>
+          </w:tcPr>
+          <w:p>
+            <w:r>
+              <w:rPr>
+                <w:b/>
+                <w:color w:val="FFFFFF"/>
+              </w:rPr>
+              <w:t>Critere</w:t>
+            </w:r>
+          </w:p>
+        </w:tc>
+        <w:tc>
+          <w:tcPr>
+            <w:tcW w:type="dxa" w:w="2280"/>
+            <w:shd w:val="clear" w:color="auto" w:fill="1E3A8A"/>
+          </w:tcPr>
+          <w:p>
+            <w:r>
+              <w:rPr>
+                <w:b/>
+                <w:color w:val="FFFFFF"/>
+              </w:rPr>
+              <w:t>Z-score</w:t>
+            </w:r>
+          </w:p>
+        </w:tc>
+        <w:tc>
+          <w:tcPr>
+            <w:tcW w:type="dxa" w:w="2280"/>
+            <w:shd w:val="clear" w:color="auto" w:fill="1E3A8A"/>
+          </w:tcPr>
+          <w:p>
+            <w:r>
+              <w:rPr>
+                <w:b/>
+                <w:color w:val="FFFFFF"/>
+              </w:rPr>
+              <w:t>IQR</w:t>
+            </w:r>
+          </w:p>
+        </w:tc>
+        <w:tc>
+          <w:tcPr>
+            <w:tcW w:type="dxa" w:w="2280"/>
+            <w:shd w:val="clear" w:color="auto" w:fill="1E3A8A"/>
+          </w:tcPr>
+          <w:p>
+            <w:r>
+              <w:rPr>
+                <w:b/>
+                <w:color w:val="FFFFFF"/>
+              </w:rPr>
+              <w:t>Isolation Forest</w:t>
+            </w:r>
+          </w:p>
+        </w:tc>
+      </w:tr>
+      <w:tr>
+        <w:tc>
+          <w:tcPr>
+            <w:tcW w:type="dxa" w:w="2280"/>
+          </w:tcPr>
+          <w:p>
+            <w:r>
+              <w:t>Bibliotheque</w:t>
+            </w:r>
+          </w:p>
+        </w:tc>
+        <w:tc>
+          <w:tcPr>
+            <w:tcW w:type="dxa" w:w="2280"/>
+          </w:tcPr>
+          <w:p>
+            <w:r>
+              <w:t>NumPy</w:t>
+            </w:r>
+          </w:p>
+        </w:tc>
+        <w:tc>
+          <w:tcPr>
+            <w:tcW w:type="dxa" w:w="2280"/>
+          </w:tcPr>
+          <w:p>
+            <w:r>
+              <w:t>NumPy</w:t>
+            </w:r>
+          </w:p>
+        </w:tc>
+        <w:tc>
+          <w:tcPr>
+            <w:tcW w:type="dxa" w:w="2280"/>
+            <w:shd w:val="clear" w:color="auto" w:fill="EFF6FF"/>
+          </w:tcPr>
+          <w:p>
+            <w:r>
+              <w:t>scikit-learn</w:t>
+            </w:r>
+          </w:p>
+        </w:tc>
+      </w:tr>
+      <w:tr>
+        <w:tc>
+          <w:tcPr>
+            <w:tcW w:type="dxa" w:w="2280"/>
+          </w:tcPr>
+          <w:p>
+            <w:r>
+              <w:t>Type</w:t>
+            </w:r>
+          </w:p>
+        </w:tc>
+        <w:tc>
+          <w:tcPr>
+            <w:tcW w:type="dxa" w:w="2280"/>
+          </w:tcPr>
+          <w:p>
+            <w:r>
+              <w:t>Statistique</w:t>
+            </w:r>
+          </w:p>
+        </w:tc>
+        <w:tc>
+          <w:tcPr>
+            <w:tcW w:type="dxa" w:w="2280"/>
+          </w:tcPr>
+          <w:p>
+            <w:r>
+              <w:t>Statistique</w:t>
+            </w:r>
+          </w:p>
+        </w:tc>
+        <w:tc>
+          <w:tcPr>
+            <w:tcW w:type="dxa" w:w="2280"/>
+            <w:shd w:val="clear" w:color="auto" w:fill="EFF6FF"/>
+          </w:tcPr>
+          <w:p>
+            <w:r>
+              <w:t>Machine Learning</w:t>
+            </w:r>
+          </w:p>
+        </w:tc>
+      </w:tr>
+      <w:tr>
+        <w:tc>
+          <w:tcPr>
+            <w:tcW w:type="dxa" w:w="2280"/>
+          </w:tcPr>
+          <w:p>
+            <w:r>
+              <w:t>Hypothese</w:t>
+            </w:r>
+          </w:p>
+        </w:tc>
+        <w:tc>
+          <w:tcPr>
+            <w:tcW w:type="dxa" w:w="2280"/>
+          </w:tcPr>
+          <w:p>
+            <w:r>
+              <w:t>Distribution norm.</w:t>
+            </w:r>
+          </w:p>
+        </w:tc>
+        <w:tc>
+          <w:tcPr>
+            <w:tcW w:type="dxa" w:w="2280"/>
+          </w:tcPr>
+          <w:p>
+            <w:r>
+              <w:t>Symetrie IQR</w:t>
+            </w:r>
+          </w:p>
+        </w:tc>
+        <w:tc>
+          <w:tcPr>
+            <w:tcW w:type="dxa" w:w="2280"/>
+            <w:shd w:val="clear" w:color="auto" w:fill="EFF6FF"/>
+          </w:tcPr>
+          <w:p>
+            <w:r>
+              <w:t>Aucune</w:t>
+            </w:r>
+          </w:p>
+        </w:tc>
+      </w:tr>
+      <w:tr>
+        <w:tc>
+          <w:tcPr>
+            <w:tcW w:type="dxa" w:w="2280"/>
+          </w:tcPr>
+          <w:p>
+            <w:r>
+              <w:t>Sensible aux extremes</w:t>
+            </w:r>
+          </w:p>
+        </w:tc>
+        <w:tc>
+          <w:tcPr>
+            <w:tcW w:type="dxa" w:w="2280"/>
+          </w:tcPr>
+          <w:p>
+            <w:r>
+              <w:t>Oui</w:t>
+            </w:r>
+          </w:p>
+        </w:tc>
+        <w:tc>
+          <w:tcPr>
+            <w:tcW w:type="dxa" w:w="2280"/>
+          </w:tcPr>
+          <w:p>
+            <w:r>
+              <w:t>Non (robuste)</w:t>
+            </w:r>
+          </w:p>
+        </w:tc>
+        <w:tc>
+          <w:tcPr>
+            <w:tcW w:type="dxa" w:w="2280"/>
+            <w:shd w:val="clear" w:color="auto" w:fill="EFF6FF"/>
+          </w:tcPr>
+          <w:p>
+            <w:r>
+              <w:t>Non (robuste)</w:t>
+            </w:r>
+          </w:p>
+        </w:tc>
+      </w:tr>
+      <w:tr>
+        <w:tc>
+          <w:tcPr>
+            <w:tcW w:type="dxa" w:w="2280"/>
+          </w:tcPr>
+          <w:p>
+            <w:r>
+              <w:t>Apprentissage</w:t>
+            </w:r>
+          </w:p>
+        </w:tc>
+        <w:tc>
+          <w:tcPr>
+            <w:tcW w:type="dxa" w:w="2280"/>
+          </w:tcPr>
+          <w:p>
+            <w:r>
+              <w:t>Non</w:t>
+            </w:r>
+          </w:p>
+        </w:tc>
+        <w:tc>
+          <w:tcPr>
+            <w:tcW w:type="dxa" w:w="2280"/>
+          </w:tcPr>
+          <w:p>
+            <w:r>
+              <w:t>Non</w:t>
+            </w:r>
+          </w:p>
+        </w:tc>
+        <w:tc>
+          <w:tcPr>
+            <w:tcW w:type="dxa" w:w="2280"/>
+            <w:shd w:val="clear" w:color="auto" w:fill="EFF6FF"/>
+          </w:tcPr>
+          <w:p>
+            <w:r>
+              <w:t>Oui (non-supervise)</w:t>
+            </w:r>
+          </w:p>
+        </w:tc>
+      </w:tr>
+      <w:tr>
+        <w:tc>
+          <w:tcPr>
+            <w:tcW w:type="dxa" w:w="2280"/>
+          </w:tcPr>
+          <w:p>
+            <w:r>
+              <w:t>Fenetre</w:t>
+            </w:r>
+          </w:p>
+        </w:tc>
+        <w:tc>
+          <w:tcPr>
+            <w:tcW w:type="dxa" w:w="2280"/>
+          </w:tcPr>
+          <w:p>
+            <w:r>
+              <w:t>30 lectures</w:t>
+            </w:r>
+          </w:p>
+        </w:tc>
+        <w:tc>
+          <w:tcPr>
+            <w:tcW w:type="dxa" w:w="2280"/>
+          </w:tcPr>
+          <w:p>
+            <w:r>
+              <w:t>30 lectures</w:t>
+            </w:r>
+          </w:p>
+        </w:tc>
+        <w:tc>
+          <w:tcPr>
+            <w:tcW w:type="dxa" w:w="2280"/>
+            <w:shd w:val="clear" w:color="auto" w:fill="EFF6FF"/>
+          </w:tcPr>
+          <w:p>
+            <w:r>
+              <w:t>100 lectures</w:t>
+            </w:r>
+          </w:p>
+        </w:tc>
+      </w:tr>
+      <w:tr>
+        <w:tc>
+          <w:tcPr>
+            <w:tcW w:type="dxa" w:w="2280"/>
+          </w:tcPr>
+          <w:p>
+            <w:r>
+              <w:t>CRITICAL si</w:t>
+            </w:r>
+          </w:p>
+        </w:tc>
+        <w:tc>
+          <w:tcPr>
+            <w:tcW w:type="dxa" w:w="2280"/>
+          </w:tcPr>
+          <w:p>
+            <w:r>
+              <w:t>|z| &gt; 3</w:t>
+            </w:r>
+          </w:p>
+        </w:tc>
+        <w:tc>
+          <w:tcPr>
+            <w:tcW w:type="dxa" w:w="2280"/>
+          </w:tcPr>
+          <w:p>
+            <w:r>
+              <w:t>Hors 3*IQR</w:t>
+            </w:r>
+          </w:p>
+        </w:tc>
+        <w:tc>
+          <w:tcPr>
+            <w:tcW w:type="dxa" w:w="2280"/>
+            <w:shd w:val="clear" w:color="auto" w:fill="EFF6FF"/>
+          </w:tcPr>
+          <w:p>
+            <w:r>
+              <w:t>score &lt; -0.1</w:t>
+            </w:r>
+          </w:p>
+        </w:tc>
+      </w:tr>
+    </w:tbl>
+    <w:p/>
     <w:p>
       <w:pPr>
         <w:pStyle w:val="Heading1"/>
@@ -1265,12 +2106,258 @@
         <w:rPr>
           <w:color w:val="1E40AF"/>
         </w:rPr>
-        <w:t>4. Export des donnees : complet vs nettoye</w:t>
+        <w:t>4. Moteur de detection combine</w:t>
       </w:r>
     </w:p>
     <w:p>
       <w:r>
-        <w:t>Chaque lecture capteur est stockee en base de donnees avec son niveau detecte (NORMAL, WARNING, CRITICAL). L'utilisateur peut exporter ces donnees en deux versions via la page /logs :</w:t>
+        <w:t>Le moteur de detection (AnomalyDetectionEngine) orchestre les 4 detecteurs en parallele sur chaque lecture et retourne le niveau le plus severe.</w:t>
+      </w:r>
+    </w:p>
+    <w:p>
+      <w:pPr>
+        <w:spacing w:before="0" w:after="0"/>
+        <w:ind w:left="850"/>
+      </w:pPr>
+      <w:r>
+        <w:rPr>
+          <w:rFonts w:ascii="Courier New" w:hAnsi="Courier New"/>
+          <w:color w:val="1E40AF"/>
+          <w:sz w:val="18"/>
+        </w:rPr>
+        <w:t>class AnomalyDetectionEngine:</w:t>
+      </w:r>
+    </w:p>
+    <w:p>
+      <w:pPr>
+        <w:spacing w:before="0" w:after="0"/>
+        <w:ind w:left="850"/>
+      </w:pPr>
+      <w:r>
+        <w:rPr>
+          <w:rFonts w:ascii="Courier New" w:hAnsi="Courier New"/>
+          <w:color w:val="1E40AF"/>
+          <w:sz w:val="18"/>
+        </w:rPr>
+        <w:t xml:space="preserve">    def __init__(self, window_size=30):</w:t>
+      </w:r>
+    </w:p>
+    <w:p>
+      <w:pPr>
+        <w:spacing w:before="0" w:after="0"/>
+        <w:ind w:left="850"/>
+      </w:pPr>
+      <w:r>
+        <w:rPr>
+          <w:rFonts w:ascii="Courier New" w:hAnsi="Courier New"/>
+          <w:color w:val="1E40AF"/>
+          <w:sz w:val="18"/>
+        </w:rPr>
+        <w:t xml:space="preserve">        self.rules   = RuleBasedDetector()          # seuils metier fixes</w:t>
+      </w:r>
+    </w:p>
+    <w:p>
+      <w:pPr>
+        <w:spacing w:before="0" w:after="0"/>
+        <w:ind w:left="850"/>
+      </w:pPr>
+      <w:r>
+        <w:rPr>
+          <w:rFonts w:ascii="Courier New" w:hAnsi="Courier New"/>
+          <w:color w:val="1E40AF"/>
+          <w:sz w:val="18"/>
+        </w:rPr>
+        <w:t xml:space="preserve">        self.zscore  = ZScoreDetector()             # NumPy Z-score</w:t>
+      </w:r>
+    </w:p>
+    <w:p>
+      <w:pPr>
+        <w:spacing w:before="0" w:after="0"/>
+        <w:ind w:left="850"/>
+      </w:pPr>
+      <w:r>
+        <w:rPr>
+          <w:rFonts w:ascii="Courier New" w:hAnsi="Courier New"/>
+          <w:color w:val="1E40AF"/>
+          <w:sz w:val="18"/>
+        </w:rPr>
+        <w:t xml:space="preserve">        self.iqr     = IQRDetector()                # NumPy IQR</w:t>
+      </w:r>
+    </w:p>
+    <w:p>
+      <w:pPr>
+        <w:spacing w:before="0" w:after="0"/>
+        <w:ind w:left="850"/>
+      </w:pPr>
+      <w:r>
+        <w:rPr>
+          <w:rFonts w:ascii="Courier New" w:hAnsi="Courier New"/>
+          <w:color w:val="1E40AF"/>
+          <w:sz w:val="18"/>
+        </w:rPr>
+        <w:t xml:space="preserve">        self.iforest = IsolationForestDetector()    # scikit-learn</w:t>
+      </w:r>
+    </w:p>
+    <w:p>
+      <w:pPr>
+        <w:spacing w:before="0" w:after="0"/>
+        <w:ind w:left="850"/>
+      </w:pPr>
+      <w:r>
+        <w:rPr>
+          <w:rFonts w:ascii="Courier New" w:hAnsi="Courier New"/>
+          <w:color w:val="1E40AF"/>
+          <w:sz w:val="18"/>
+        </w:rPr>
+        <w:t xml:space="preserve"> </w:t>
+      </w:r>
+    </w:p>
+    <w:p>
+      <w:pPr>
+        <w:spacing w:before="0" w:after="0"/>
+        <w:ind w:left="850"/>
+      </w:pPr>
+      <w:r>
+        <w:rPr>
+          <w:rFonts w:ascii="Courier New" w:hAnsi="Courier New"/>
+          <w:color w:val="1E40AF"/>
+          <w:sz w:val="18"/>
+        </w:rPr>
+        <w:t xml:space="preserve">    def analyze(self, reading):</w:t>
+      </w:r>
+    </w:p>
+    <w:p>
+      <w:pPr>
+        <w:spacing w:before="0" w:after="0"/>
+        <w:ind w:left="850"/>
+      </w:pPr>
+      <w:r>
+        <w:rPr>
+          <w:rFonts w:ascii="Courier New" w:hAnsi="Courier New"/>
+          <w:color w:val="1E40AF"/>
+          <w:sz w:val="18"/>
+        </w:rPr>
+        <w:t xml:space="preserve">        candidates = [</w:t>
+      </w:r>
+    </w:p>
+    <w:p>
+      <w:pPr>
+        <w:spacing w:before="0" w:after="0"/>
+        <w:ind w:left="850"/>
+      </w:pPr>
+      <w:r>
+        <w:rPr>
+          <w:rFonts w:ascii="Courier New" w:hAnsi="Courier New"/>
+          <w:color w:val="1E40AF"/>
+          <w:sz w:val="18"/>
+        </w:rPr>
+        <w:t xml:space="preserve">            self.rules.analyze(reading),</w:t>
+      </w:r>
+    </w:p>
+    <w:p>
+      <w:pPr>
+        <w:spacing w:before="0" w:after="0"/>
+        <w:ind w:left="850"/>
+      </w:pPr>
+      <w:r>
+        <w:rPr>
+          <w:rFonts w:ascii="Courier New" w:hAnsi="Courier New"/>
+          <w:color w:val="1E40AF"/>
+          <w:sz w:val="18"/>
+        </w:rPr>
+        <w:t xml:space="preserve">            self.zscore.analyze(reading),</w:t>
+      </w:r>
+    </w:p>
+    <w:p>
+      <w:pPr>
+        <w:spacing w:before="0" w:after="0"/>
+        <w:ind w:left="850"/>
+      </w:pPr>
+      <w:r>
+        <w:rPr>
+          <w:rFonts w:ascii="Courier New" w:hAnsi="Courier New"/>
+          <w:color w:val="1E40AF"/>
+          <w:sz w:val="18"/>
+        </w:rPr>
+        <w:t xml:space="preserve">            self.iqr.analyze(reading),</w:t>
+      </w:r>
+    </w:p>
+    <w:p>
+      <w:pPr>
+        <w:spacing w:before="0" w:after="0"/>
+        <w:ind w:left="850"/>
+      </w:pPr>
+      <w:r>
+        <w:rPr>
+          <w:rFonts w:ascii="Courier New" w:hAnsi="Courier New"/>
+          <w:color w:val="1E40AF"/>
+          <w:sz w:val="18"/>
+        </w:rPr>
+        <w:t xml:space="preserve">            self.iforest.analyze(reading),</w:t>
+      </w:r>
+    </w:p>
+    <w:p>
+      <w:pPr>
+        <w:spacing w:before="0" w:after="0"/>
+        <w:ind w:left="850"/>
+      </w:pPr>
+      <w:r>
+        <w:rPr>
+          <w:rFonts w:ascii="Courier New" w:hAnsi="Courier New"/>
+          <w:color w:val="1E40AF"/>
+          <w:sz w:val="18"/>
+        </w:rPr>
+        <w:t xml:space="preserve">        ]</w:t>
+      </w:r>
+    </w:p>
+    <w:p>
+      <w:pPr>
+        <w:spacing w:before="0" w:after="0"/>
+        <w:ind w:left="850"/>
+      </w:pPr>
+      <w:r>
+        <w:rPr>
+          <w:rFonts w:ascii="Courier New" w:hAnsi="Courier New"/>
+          <w:color w:val="1E40AF"/>
+          <w:sz w:val="18"/>
+        </w:rPr>
+        <w:t xml:space="preserve">        # Strategie worst-case : retenir le niveau le plus severe</w:t>
+      </w:r>
+    </w:p>
+    <w:p>
+      <w:pPr>
+        <w:spacing w:before="0" w:after="0"/>
+        <w:ind w:left="850"/>
+      </w:pPr>
+      <w:r>
+        <w:rPr>
+          <w:rFonts w:ascii="Courier New" w:hAnsi="Courier New"/>
+          <w:color w:val="1E40AF"/>
+          <w:sz w:val="18"/>
+        </w:rPr>
+        <w:t xml:space="preserve">        return max(candidates, key=lambda r: SEVERITY[r.level])</w:t>
+      </w:r>
+    </w:p>
+    <w:p/>
+    <w:p>
+      <w:r>
+        <w:t>Exemple : si les regles metier retournent WARNING et l'Isolation Forest retourne CRITICAL, le systeme enregistre CRITICAL. Ce mecanisme garantit qu'aucune anomalie ne passe entre les mailles des differentes methodes.</w:t>
+      </w:r>
+    </w:p>
+    <w:p>
+      <w:pPr>
+        <w:pStyle w:val="Heading1"/>
+      </w:pPr>
+      <w:r>
+        <w:rPr>
+          <w:color w:val="1E40AF"/>
+        </w:rPr>
+        <w:t>5. Export des donnees : complet vs nettoye</w:t>
+      </w:r>
+    </w:p>
+    <w:p>
+      <w:r>
+        <w:t>Chaque lecture est stockee avec son niveau detecte (NORMAL, WARNING, CRITICAL). L'utilisateur peut exporter en deux versions depuis la page /logs :</w:t>
       </w:r>
     </w:p>
     <w:p>
@@ -1281,7 +2368,7 @@
         <w:rPr>
           <w:sz w:val="22"/>
         </w:rPr>
-        <w:t>Donnees completes : toutes les lectures, y compris les aberrantes (WARNING/CRITICAL).</w:t>
+        <w:t>Donnees completes : toutes les lectures, y compris aberrantes.</w:t>
       </w:r>
     </w:p>
     <w:p>
@@ -1297,7 +2384,7 @@
     </w:p>
     <w:p>
       <w:r>
-        <w:t>Cote serveur (FastAPI), le filtrage est realise via SQLAlchemy :</w:t>
+        <w:t>Filtrage cote serveur via SQLAlchemy :</w:t>
       </w:r>
     </w:p>
     <w:p>
@@ -1373,7 +2460,7 @@
     <w:p/>
     <w:p>
       <w:r>
-        <w:t>Les fichiers telecharges contiennent un en-tete informatif :</w:t>
+        <w:t>Chaque fichier telecharge contient un message informatif :</w:t>
       </w:r>
     </w:p>
     <w:p>
@@ -1384,7 +2471,7 @@
         <w:rPr>
           <w:sz w:val="22"/>
         </w:rPr>
-        <w:t>CSV  : lignes de commentaire # indiquant le nombre de lignes retirees.</w:t>
+        <w:t>CSV  : lignes de commentaire # avec le nombre de lignes retirees.</w:t>
       </w:r>
     </w:p>
     <w:p>
@@ -1417,7 +2504,7 @@
         <w:rPr>
           <w:color w:val="1E40AF"/>
         </w:rPr>
-        <w:t>5. Page de comparaison visuelle (/logs/compare)</w:t>
+        <w:t>6. Page de comparaison visuelle (/logs/compare)</w:t>
       </w:r>
     </w:p>
     <w:p>
@@ -1455,12 +2542,78 @@
         <w:rPr>
           <w:sz w:val="22"/>
         </w:rPr>
-        <w:t>KPIs globaux : total toutes donnees, total aberrantes, taux global.</w:t>
+        <w:t>KPIs globaux : total, aberrantes, taux global.</w:t>
+      </w:r>
+    </w:p>
+    <w:p>
+      <w:pPr>
+        <w:pStyle w:val="ListBullet"/>
+      </w:pPr>
+      <w:r>
+        <w:rPr>
+          <w:sz w:val="22"/>
+        </w:rPr>
+        <w:t>Interroge directement la base de donnees — instantane et toujours a jour.</w:t>
+      </w:r>
+    </w:p>
+    <w:p>
+      <w:pPr>
+        <w:pStyle w:val="Heading1"/>
+      </w:pPr>
+      <w:r>
+        <w:rPr>
+          <w:color w:val="1E40AF"/>
+        </w:rPr>
+        <w:t>7. Comparaison de deux fichiers exportes</w:t>
       </w:r>
     </w:p>
     <w:p>
       <w:r>
-        <w:t>Cette page interroge directement la base de donnees sans export intermediaire, ce qui la rend instantanee et toujours a jour.</w:t>
+        <w:t>L'utilisateur peut uploader deux fichiers CSV ou Excel pour comparer deux periodes differentes ou avant/apres une intervention.</w:t>
+      </w:r>
+    </w:p>
+    <w:p>
+      <w:pPr>
+        <w:pStyle w:val="ListBullet"/>
+      </w:pPr>
+      <w:r>
+        <w:rPr>
+          <w:sz w:val="22"/>
+        </w:rPr>
+        <w:t>Endpoint POST /api/logs/compare-two : accepte deux UploadFile.</w:t>
+      </w:r>
+    </w:p>
+    <w:p>
+      <w:pPr>
+        <w:pStyle w:val="ListBullet"/>
+      </w:pPr>
+      <w:r>
+        <w:rPr>
+          <w:sz w:val="22"/>
+        </w:rPr>
+        <w:t>Calcule par capteur : total, aberrantes, taux, et delta entre fichiers.</w:t>
+      </w:r>
+    </w:p>
+    <w:p>
+      <w:pPr>
+        <w:pStyle w:val="ListBullet"/>
+      </w:pPr>
+      <w:r>
+        <w:rPr>
+          <w:sz w:val="22"/>
+        </w:rPr>
+        <w:t>Delta negatif (moins d'aberrantes) = vert. Delta positif = rouge.</w:t>
+      </w:r>
+    </w:p>
+    <w:p>
+      <w:pPr>
+        <w:pStyle w:val="ListBullet"/>
+      </w:pPr>
+      <w:r>
+        <w:rPr>
+          <w:sz w:val="22"/>
+        </w:rPr>
+        <w:t>Export PDF de la comparaison en un clic.</w:t>
       </w:r>
     </w:p>
     <w:p>
@@ -1471,110 +2624,7 @@
         <w:rPr>
           <w:color w:val="1E40AF"/>
         </w:rPr>
-        <w:t>6. Comparaison de deux fichiers exportes</w:t>
-      </w:r>
-    </w:p>
-    <w:p>
-      <w:r>
-        <w:t>L'utilisateur peut egalement uploader deux fichiers (CSV ou Excel) prealablement exportes (par exemple : deux periodes differentes, ou avant/apres une intervention) pour les comparer.</w:t>
-      </w:r>
-    </w:p>
-    <w:p>
-      <w:r>
-        <w:t>L'endpoint FastAPI /api/logs/compare-two :</w:t>
-      </w:r>
-    </w:p>
-    <w:p>
-      <w:pPr>
-        <w:pStyle w:val="ListBullet"/>
-      </w:pPr>
-      <w:r>
-        <w:rPr>
-          <w:sz w:val="22"/>
-        </w:rPr>
-        <w:t>Accepte deux fichiers (UploadFile) en POST multipart.</w:t>
-      </w:r>
-    </w:p>
-    <w:p>
-      <w:pPr>
-        <w:pStyle w:val="ListBullet"/>
-      </w:pPr>
-      <w:r>
-        <w:rPr>
-          <w:sz w:val="22"/>
-        </w:rPr>
-        <w:t>Parse CSV (pandas) ou Excel (openpyxl) selon l'extension.</w:t>
-      </w:r>
-    </w:p>
-    <w:p>
-      <w:pPr>
-        <w:pStyle w:val="ListBullet"/>
-      </w:pPr>
-      <w:r>
-        <w:rPr>
-          <w:sz w:val="22"/>
-        </w:rPr>
-        <w:t>Calcule par capteur : total, aberrantes, taux pour chaque fichier.</w:t>
-      </w:r>
-    </w:p>
-    <w:p>
-      <w:pPr>
-        <w:pStyle w:val="ListBullet"/>
-      </w:pPr>
-      <w:r>
-        <w:rPr>
-          <w:sz w:val="22"/>
-        </w:rPr>
-        <w:t>Retourne aussi le delta (difference) : moins d'aberrantes = amelioration (vert).</w:t>
-      </w:r>
-    </w:p>
-    <w:p>
-      <w:r>
-        <w:t>L'interface affiche les resultats dans un tableau interactif avec :</w:t>
-      </w:r>
-    </w:p>
-    <w:p>
-      <w:pPr>
-        <w:pStyle w:val="ListBullet"/>
-      </w:pPr>
-      <w:r>
-        <w:rPr>
-          <w:sz w:val="22"/>
-        </w:rPr>
-        <w:t>Colonnes : Capteur, Fichier 1 (total, aberr., taux), Fichier 2 (total, aberr., taux), Delta.</w:t>
-      </w:r>
-    </w:p>
-    <w:p>
-      <w:pPr>
-        <w:pStyle w:val="ListBullet"/>
-      </w:pPr>
-      <w:r>
-        <w:rPr>
-          <w:sz w:val="22"/>
-        </w:rPr>
-        <w:t>Couleurs : delta negatif en vert (moins d'aberrantes = mieux), positif en rouge.</w:t>
-      </w:r>
-    </w:p>
-    <w:p>
-      <w:pPr>
-        <w:pStyle w:val="ListBullet"/>
-      </w:pPr>
-      <w:r>
-        <w:rPr>
-          <w:sz w:val="22"/>
-        </w:rPr>
-        <w:t>Export PDF de la comparaison en un clic (jsPDF + autoTable).</w:t>
-      </w:r>
-    </w:p>
-    <w:p>
-      <w:pPr>
-        <w:pStyle w:val="Heading1"/>
-      </w:pPr>
-      <w:r>
-        <w:rPr>
-          <w:color w:val="1E40AF"/>
-        </w:rPr>
-        <w:t>7. Recapitulatif des fonctionnalites implementees</w:t>
+        <w:t>8. Recapitulatif des fonctionnalites implementees</w:t>
       </w:r>
     </w:p>
     <w:tbl>
@@ -1706,7 +2756,7 @@
           </w:tcPr>
           <w:p>
             <w:r>
-              <w:t>Moteur combine</w:t>
+              <w:t>Detection Isolation Forest</w:t>
             </w:r>
           </w:p>
         </w:tc>
@@ -1716,7 +2766,39 @@
           </w:tcPr>
           <w:p>
             <w:r>
-              <w:t>Python (worst-case)</w:t>
+              <w:t>scikit-learn (IsolationForest)</w:t>
+            </w:r>
+          </w:p>
+        </w:tc>
+        <w:tc>
+          <w:tcPr>
+            <w:tcW w:type="dxa" w:w="3041"/>
+          </w:tcPr>
+          <w:p>
+            <w:r>
+              <w:t>src/detection/statistical.py</w:t>
+            </w:r>
+          </w:p>
+        </w:tc>
+      </w:tr>
+      <w:tr>
+        <w:tc>
+          <w:tcPr>
+            <w:tcW w:type="dxa" w:w="3041"/>
+          </w:tcPr>
+          <w:p>
+            <w:r>
+              <w:t>Moteur combine (4 detect.)</w:t>
+            </w:r>
+          </w:p>
+        </w:tc>
+        <w:tc>
+          <w:tcPr>
+            <w:tcW w:type="dxa" w:w="3041"/>
+          </w:tcPr>
+          <w:p>
+            <w:r>
+              <w:t>Python worst-case</w:t>
             </w:r>
           </w:p>
         </w:tc>
@@ -1844,7 +2926,7 @@
           </w:tcPr>
           <w:p>
             <w:r>
-              <w:t>jsPDF + autoTable (nav.)</w:t>
+              <w:t>jsPDF + autoTable</w:t>
             </w:r>
           </w:p>
         </w:tc>
@@ -1938,7 +3020,7 @@
     </w:p>
     <w:p>
       <w:r>
-        <w:t>L'utilisation de NumPy pour la detection des valeurs aberrantes repond directement a la demande de l'encadreur. Les methodes Z-score et IQR, bien etablies en statistique, sont implementees de facon efficace grace aux fonctions vectorisees de NumPy.</w:t>
+        <w:t>L'utilisation combinee de NumPy et scikit-learn repond directement a la demande de l'encadreur. Les methodes Z-score et IQR (NumPy) couvrent les anomalies statistiques classiques, tandis que l'Isolation Forest (scikit-learn) apporte une couche d'apprentissage automatique non-supervise capable de detecter des comportements anormaux sans hypothese sur la distribution des donnees.</w:t>
       </w:r>
     </w:p>
     <w:p>
@@ -1954,7 +3036,7 @@
         <w:rPr>
           <w:sz w:val="22"/>
         </w:rPr>
-        <w:t>Une detection en temps reel multi-methodes (regles + Z-score + IQR).</w:t>
+        <w:t>Une detection en temps reel avec 4 methodes complementaires.</w:t>
       </w:r>
     </w:p>
     <w:p>
@@ -1965,7 +3047,7 @@
         <w:rPr>
           <w:sz w:val="22"/>
         </w:rPr>
-        <w:t>Un export des donnees dans trois formats avec bilan de nettoyage.</w:t>
+        <w:t>Un export des donnees dans 3 formats avec bilan de nettoyage.</w:t>
       </w:r>
     </w:p>
     <w:p>

</xml_diff>